<commit_message>
Publish updated LTI communication
</commit_message>
<xml_diff>
--- a/lti/downloads/Aivel_LTI_plan.docx
+++ b/lti/downloads/Aivel_LTI_plan.docx
@@ -597,12 +597,12 @@
         <w:pStyle w:val="Heading2"/>
       </w:pPr>
       <w:r>
-        <w:t>Пример 1. Один годовой пакет: оклад 5 млн ₽, пакет 0,7 оклада</w:t>
+        <w:t>Пример 1. Один годовой пакет: цель 5 млн ₽, заработано 4,75 млн ₽</w:t>
       </w:r>
     </w:p>
     <w:p>
       <w:r>
-        <w:t>На начало первого года стоимость капитала после вложения 400 млн ₽ равна 1,6 млрд ₽. Цена расчетной единицы остается 12 ₽: 1,6 млрд ₽ делятся на 133,333 млн единиц. При выполнении результата на 100% подтвержденная стоимость пакета Марии равна 3,5 млн ₽.</w:t>
+        <w:t>На начало первого года стоимость капитала после вложения 400 млн ₽ равна 1,6 млрд ₽. Цена расчетной единицы остается 12 ₽: 1,6 млрд ₽ делятся на 133,333 млн единиц. Компания выполняет цель на 90%, Мария — на 102,5%. По формуле 60% / 40% итог равен 95%; результат ограничен 100%. Поэтому заработанная стоимость пакета Марии равна 4,75 млн ₽.</w:t>
       </w:r>
     </w:p>
     <w:tbl>
@@ -752,7 +752,7 @@
               <w:rPr>
                 <w:sz w:val="18"/>
               </w:rPr>
-              <w:t>5 млн ₽ × 0,7</w:t>
+              <w:t>5 млн ₽ × 1,0</w:t>
             </w:r>
           </w:p>
         </w:tc>
@@ -775,7 +775,7 @@
               <w:rPr>
                 <w:sz w:val="18"/>
               </w:rPr>
-              <w:t>3,5 млн ₽</w:t>
+              <w:t>5 млн ₽</w:t>
             </w:r>
           </w:p>
         </w:tc>
@@ -823,7 +823,7 @@
               <w:rPr>
                 <w:sz w:val="18"/>
               </w:rPr>
-              <w:t>60% × 100% + 40% × 100%</w:t>
+              <w:t>60% × 90% + 40% × 102,5%</w:t>
             </w:r>
           </w:p>
         </w:tc>
@@ -846,7 +846,7 @@
               <w:rPr>
                 <w:sz w:val="18"/>
               </w:rPr>
-              <w:t>100%</w:t>
+              <w:t>95%</w:t>
             </w:r>
           </w:p>
         </w:tc>
@@ -871,7 +871,7 @@
               <w:rPr>
                 <w:sz w:val="18"/>
               </w:rPr>
-              <w:t>Начальная цена</w:t>
+              <w:t>Заработанный пакет</w:t>
             </w:r>
           </w:p>
         </w:tc>
@@ -894,7 +894,7 @@
               <w:rPr>
                 <w:sz w:val="18"/>
               </w:rPr>
-              <w:t>1,6 млрд ₽ ÷ 133,333 млн</w:t>
+              <w:t>5 млн ₽ × 1,0 × 95%</w:t>
             </w:r>
           </w:p>
         </w:tc>
@@ -917,7 +917,7 @@
               <w:rPr>
                 <w:sz w:val="18"/>
               </w:rPr>
-              <w:t>12 ₽</w:t>
+              <w:t>4,75 млн ₽</w:t>
             </w:r>
           </w:p>
         </w:tc>
@@ -942,7 +942,7 @@
               <w:rPr>
                 <w:sz w:val="18"/>
               </w:rPr>
-              <w:t>Число единиц</w:t>
+              <w:t>Начальная цена</w:t>
             </w:r>
           </w:p>
         </w:tc>
@@ -965,7 +965,7 @@
               <w:rPr>
                 <w:sz w:val="18"/>
               </w:rPr>
-              <w:t>3,5 млн ₽ ÷ 12 ₽</w:t>
+              <w:t>1,6 млрд ₽ ÷ 133,333 млн</w:t>
             </w:r>
           </w:p>
         </w:tc>
@@ -988,7 +988,7 @@
               <w:rPr>
                 <w:sz w:val="18"/>
               </w:rPr>
-              <w:t>291 667</w:t>
+              <w:t>12 ₽</w:t>
             </w:r>
           </w:p>
         </w:tc>
@@ -1013,7 +1013,7 @@
               <w:rPr>
                 <w:sz w:val="18"/>
               </w:rPr>
-              <w:t>Цена при продаже</w:t>
+              <w:t>Число единиц</w:t>
             </w:r>
           </w:p>
         </w:tc>
@@ -1036,7 +1036,7 @@
               <w:rPr>
                 <w:sz w:val="18"/>
               </w:rPr>
-              <w:t>16 млрд ₽ ÷ 205,579 млн</w:t>
+              <w:t>4,75 млн ₽ ÷ 12 ₽</w:t>
             </w:r>
           </w:p>
         </w:tc>
@@ -1059,7 +1059,7 @@
               <w:rPr>
                 <w:sz w:val="18"/>
               </w:rPr>
-              <w:t>77,83 ₽</w:t>
+              <w:t>≈ 395 833</w:t>
             </w:r>
           </w:p>
         </w:tc>
@@ -1084,6 +1084,77 @@
               <w:rPr>
                 <w:sz w:val="18"/>
               </w:rPr>
+              <w:t>Цена при продаже</w:t>
+            </w:r>
+          </w:p>
+        </w:tc>
+        <w:tc>
+          <w:tcPr>
+            <w:tcW w:type="dxa" w:w="4464"/>
+            <w:vAlign w:val="center"/>
+            <w:tcMar>
+              <w:top w:w="90" w:type="dxa"/>
+              <w:start w:w="110" w:type="dxa"/>
+              <w:bottom w:w="90" w:type="dxa"/>
+              <w:end w:w="110" w:type="dxa"/>
+            </w:tcMar>
+          </w:tcPr>
+          <w:p>
+            <w:pPr>
+              <w:spacing w:after="0" w:before="0" w:line="240" w:lineRule="auto"/>
+            </w:pPr>
+            <w:r>
+              <w:rPr>
+                <w:sz w:val="18"/>
+              </w:rPr>
+              <w:t>16 млрд ₽ ÷ 205,579 млн</w:t>
+            </w:r>
+          </w:p>
+        </w:tc>
+        <w:tc>
+          <w:tcPr>
+            <w:tcW w:type="dxa" w:w="1944"/>
+            <w:vAlign w:val="center"/>
+            <w:tcMar>
+              <w:top w:w="90" w:type="dxa"/>
+              <w:start w:w="110" w:type="dxa"/>
+              <w:bottom w:w="90" w:type="dxa"/>
+              <w:end w:w="110" w:type="dxa"/>
+            </w:tcMar>
+          </w:tcPr>
+          <w:p>
+            <w:pPr>
+              <w:spacing w:after="0" w:before="0" w:line="240" w:lineRule="auto"/>
+            </w:pPr>
+            <w:r>
+              <w:rPr>
+                <w:sz w:val="18"/>
+              </w:rPr>
+              <w:t>77,83 ₽</w:t>
+            </w:r>
+          </w:p>
+        </w:tc>
+      </w:tr>
+      <w:tr>
+        <w:tc>
+          <w:tcPr>
+            <w:tcW w:type="dxa" w:w="2448"/>
+            <w:vAlign w:val="center"/>
+            <w:tcMar>
+              <w:top w:w="90" w:type="dxa"/>
+              <w:start w:w="110" w:type="dxa"/>
+              <w:bottom w:w="90" w:type="dxa"/>
+              <w:end w:w="110" w:type="dxa"/>
+            </w:tcMar>
+          </w:tcPr>
+          <w:p>
+            <w:pPr>
+              <w:spacing w:after="0" w:before="0" w:line="240" w:lineRule="auto"/>
+            </w:pPr>
+            <w:r>
+              <w:rPr>
+                <w:sz w:val="18"/>
+              </w:rPr>
               <w:t>Стоимость пакета</w:t>
             </w:r>
           </w:p>
@@ -1107,7 +1178,7 @@
               <w:rPr>
                 <w:sz w:val="18"/>
               </w:rPr>
-              <w:t>291 667 × 77,83 ₽</w:t>
+              <w:t>395 833 × 77,83 ₽</w:t>
             </w:r>
           </w:p>
         </w:tc>
@@ -1130,7 +1201,7 @@
               <w:rPr>
                 <w:sz w:val="18"/>
               </w:rPr>
-              <w:t>≈ 22,7 млн ₽</w:t>
+              <w:t>≈ 30,8 млн ₽</w:t>
             </w:r>
           </w:p>
         </w:tc>
@@ -1138,7 +1209,7 @@
     </w:tbl>
     <w:p>
       <w:r>
-        <w:t>Право на пакет закрепляется по 1/12 за каждый полный квартал после подтверждения результата. К продаже после пятого года этот первый пакет закреплен полностью. Сумма 22,7 млн ₽ указана до личных налогов и возможных удержаний по условиям сделки.</w:t>
+        <w:t>Право на пакет закрепляется по 1/12 за каждый полный квартал после подтверждения результата. К продаже после пятого года этот первый пакет закреплен полностью. Сумма 30,8 млн ₽ указана до личных налогов и возможных удержаний по условиям сделки.</w:t>
       </w:r>
     </w:p>
     <w:p>
@@ -1151,7 +1222,7 @@
     </w:p>
     <w:p>
       <w:r>
-        <w:t>Мария получает новый пакет 0,7 оклада в каждом из пяти лет. Каждый пакет имеет собственную начальную цену и собственный 36-месячный график закрепления права.</w:t>
+        <w:t>Мария каждый год получает целевой пакет 1,0 оклада и зарабатывает 95%, то есть 4,75 млн ₽ по цене начала соответствующего года. Каждый пакет имеет собственную начальную цену и собственный 36-месячный график закрепления права.</w:t>
       </w:r>
     </w:p>
     <w:tbl>
@@ -1380,9 +1451,9 @@
               <w:rPr>
                 <w:sz w:val="17"/>
               </w:rPr>
-              <w:t>3,5 млн ₽</w:t>
+              <w:t>4,75 млн ₽</w:t>
               <w:br/>
-              <w:t>292 тыс.</w:t>
+              <w:t>396 тыс.</w:t>
             </w:r>
           </w:p>
         </w:tc>
@@ -1428,7 +1499,7 @@
               <w:rPr>
                 <w:sz w:val="17"/>
               </w:rPr>
-              <w:t>22,7 млн ₽</w:t>
+              <w:t>30,8 млн ₽</w:t>
             </w:r>
           </w:p>
         </w:tc>
@@ -1501,9 +1572,9 @@
               <w:rPr>
                 <w:sz w:val="17"/>
               </w:rPr>
-              <w:t>3,5 млн ₽</w:t>
+              <w:t>4,75 млн ₽</w:t>
               <w:br/>
-              <w:t>146 тыс.</w:t>
+              <w:t>198 тыс.</w:t>
             </w:r>
           </w:p>
         </w:tc>
@@ -1549,7 +1620,7 @@
               <w:rPr>
                 <w:sz w:val="17"/>
               </w:rPr>
-              <w:t>11,4 млн ₽</w:t>
+              <w:t>15,4 млн ₽</w:t>
             </w:r>
           </w:p>
         </w:tc>
@@ -1622,9 +1693,9 @@
               <w:rPr>
                 <w:sz w:val="17"/>
               </w:rPr>
-              <w:t>3,5 млн ₽</w:t>
+              <w:t>4,75 млн ₽</w:t>
               <w:br/>
-              <w:t>91 тыс.</w:t>
+              <w:t>124 тыс.</w:t>
             </w:r>
           </w:p>
         </w:tc>
@@ -1670,7 +1741,7 @@
               <w:rPr>
                 <w:sz w:val="17"/>
               </w:rPr>
-              <w:t>4,7 млн ₽</w:t>
+              <w:t>6,4 млн ₽</w:t>
             </w:r>
           </w:p>
         </w:tc>
@@ -1743,9 +1814,9 @@
               <w:rPr>
                 <w:sz w:val="17"/>
               </w:rPr>
-              <w:t>3,5 млн ₽</w:t>
+              <w:t>4,75 млн ₽</w:t>
               <w:br/>
-              <w:t>63 тыс.</w:t>
+              <w:t>85 тыс.</w:t>
             </w:r>
           </w:p>
         </w:tc>
@@ -1791,7 +1862,7 @@
               <w:rPr>
                 <w:sz w:val="17"/>
               </w:rPr>
-              <w:t>1,6 млн ₽</w:t>
+              <w:t>2,2 млн ₽</w:t>
             </w:r>
           </w:p>
         </w:tc>
@@ -1864,9 +1935,9 @@
               <w:rPr>
                 <w:sz w:val="17"/>
               </w:rPr>
-              <w:t>3,5 млн ₽</w:t>
+              <w:t>4,75 млн ₽</w:t>
               <w:br/>
-              <w:t>48 тыс.</w:t>
+              <w:t>65 тыс.</w:t>
             </w:r>
           </w:p>
         </w:tc>
@@ -1983,9 +2054,9 @@
               <w:rPr>
                 <w:sz w:val="17"/>
               </w:rPr>
-              <w:t>17,5 млн ₽</w:t>
+              <w:t>23,75 млн ₽</w:t>
               <w:br/>
-              <w:t>640 тыс.</w:t>
+              <w:t>868 тыс.</w:t>
             </w:r>
           </w:p>
         </w:tc>
@@ -2031,7 +2102,7 @@
               <w:rPr>
                 <w:sz w:val="17"/>
               </w:rPr>
-              <w:t>40,4 млн ₽</w:t>
+              <w:t>54,8 млн ₽</w:t>
             </w:r>
           </w:p>
         </w:tc>
@@ -2039,7 +2110,7 @@
     </w:tbl>
     <w:p>
       <w:r>
-        <w:t>К продаже первые два пакета закреплены полностью, третий — на две трети, четвертый — на одну треть, пятый еще не начал закрепляться. Поэтому программа может быть почти полностью распределена, хотя не все права уже закрепились. Условная стоимость закрепившейся части пяти пакетов Марии — около 40,4 млн ₽.</w:t>
+        <w:t>К продаже первые два пакета закреплены полностью, третий — на две трети, четвертый — на одну треть, пятый еще не начал закрепляться. Поэтому программа может быть почти полностью распределена, хотя не все права уже закрепились. Условная стоимость закрепившейся части пяти пакетов Марии — около 54,8 млн ₽.</w:t>
       </w:r>
     </w:p>
     <w:p>
@@ -2814,7 +2885,7 @@
     </w:p>
     <w:p>
       <w:r>
-        <w:t>Базовый сценарий предполагает 15 участников ежегодно, годовой оклад 5 млн ₽, средний пакет 0,7 оклада и выполнение результата на 100%. Совокупная целевая стоимость пакетов каждого года — 52,5 млн ₽.</w:t>
+        <w:t>Базовый сценарий предполагает 8 участников в первый год, по 12 в годы 2–4 и до 15 в пятом году как резерв максимального расширения. Ёмкость проверяется по максимальному целевому пакету 1,0 оклада, или 5 млн ₽. Всего — 59 решений.</w:t>
       </w:r>
     </w:p>
     <w:tbl>
@@ -2866,7 +2937,7 @@
                 <w:color w:val="FFFFFF"/>
                 <w:sz w:val="17"/>
               </w:rPr>
-              <w:t>Год</w:t>
+              <w:t>Год / участников</w:t>
             </w:r>
           </w:p>
         </w:tc>
@@ -2995,7 +3066,7 @@
               <w:rPr>
                 <w:sz w:val="17"/>
               </w:rPr>
-              <w:t>1</w:t>
+              <w:t>1 / 8</w:t>
             </w:r>
           </w:p>
         </w:tc>
@@ -3041,7 +3112,7 @@
               <w:rPr>
                 <w:sz w:val="17"/>
               </w:rPr>
-              <w:t>4,375 млн</w:t>
+              <w:t>3,333 млн</w:t>
             </w:r>
           </w:p>
         </w:tc>
@@ -3064,7 +3135,7 @@
               <w:rPr>
                 <w:sz w:val="17"/>
               </w:rPr>
-              <w:t>4,375 млн</w:t>
+              <w:t>3,333 млн</w:t>
             </w:r>
           </w:p>
         </w:tc>
@@ -3087,7 +3158,7 @@
               <w:rPr>
                 <w:sz w:val="17"/>
               </w:rPr>
-              <w:t>43,8%</w:t>
+              <w:t>33,3%</w:t>
             </w:r>
           </w:p>
         </w:tc>
@@ -3112,7 +3183,7 @@
               <w:rPr>
                 <w:sz w:val="17"/>
               </w:rPr>
-              <w:t>2</w:t>
+              <w:t>2 / 12</w:t>
             </w:r>
           </w:p>
         </w:tc>
@@ -3158,7 +3229,7 @@
               <w:rPr>
                 <w:sz w:val="17"/>
               </w:rPr>
-              <w:t>2,188 млн</w:t>
+              <w:t>2,5 млн</w:t>
             </w:r>
           </w:p>
         </w:tc>
@@ -3181,7 +3252,7 @@
               <w:rPr>
                 <w:sz w:val="17"/>
               </w:rPr>
-              <w:t>6,562 млн</w:t>
+              <w:t>5,833 млн</w:t>
             </w:r>
           </w:p>
         </w:tc>
@@ -3204,7 +3275,7 @@
               <w:rPr>
                 <w:sz w:val="17"/>
               </w:rPr>
-              <w:t>65,6%</w:t>
+              <w:t>58,3%</w:t>
             </w:r>
           </w:p>
         </w:tc>
@@ -3229,7 +3300,7 @@
               <w:rPr>
                 <w:sz w:val="17"/>
               </w:rPr>
-              <w:t>3</w:t>
+              <w:t>3 / 12</w:t>
             </w:r>
           </w:p>
         </w:tc>
@@ -3275,7 +3346,7 @@
               <w:rPr>
                 <w:sz w:val="17"/>
               </w:rPr>
-              <w:t>1,367 млн</w:t>
+              <w:t>1,562 млн</w:t>
             </w:r>
           </w:p>
         </w:tc>
@@ -3298,7 +3369,7 @@
               <w:rPr>
                 <w:sz w:val="17"/>
               </w:rPr>
-              <w:t>7,93 млн</w:t>
+              <w:t>7,396 млн</w:t>
             </w:r>
           </w:p>
         </w:tc>
@@ -3321,7 +3392,7 @@
               <w:rPr>
                 <w:sz w:val="17"/>
               </w:rPr>
-              <w:t>79,3%</w:t>
+              <w:t>74%</w:t>
             </w:r>
           </w:p>
         </w:tc>
@@ -3346,7 +3417,7 @@
               <w:rPr>
                 <w:sz w:val="17"/>
               </w:rPr>
-              <w:t>4</w:t>
+              <w:t>4 / 12</w:t>
             </w:r>
           </w:p>
         </w:tc>
@@ -3392,7 +3463,7 @@
               <w:rPr>
                 <w:sz w:val="17"/>
               </w:rPr>
-              <w:t>0,944 млн</w:t>
+              <w:t>1,078 млн</w:t>
             </w:r>
           </w:p>
         </w:tc>
@@ -3415,7 +3486,7 @@
               <w:rPr>
                 <w:sz w:val="17"/>
               </w:rPr>
-              <w:t>8,873 млн</w:t>
+              <w:t>8,474 млн</w:t>
             </w:r>
           </w:p>
         </w:tc>
@@ -3438,7 +3509,7 @@
               <w:rPr>
                 <w:sz w:val="17"/>
               </w:rPr>
-              <w:t>88,7%</w:t>
+              <w:t>84,7%</w:t>
             </w:r>
           </w:p>
         </w:tc>
@@ -3463,7 +3534,7 @@
               <w:rPr>
                 <w:sz w:val="17"/>
               </w:rPr>
-              <w:t>5</w:t>
+              <w:t>5 / 15</w:t>
             </w:r>
           </w:p>
         </w:tc>
@@ -3509,7 +3580,7 @@
               <w:rPr>
                 <w:sz w:val="17"/>
               </w:rPr>
-              <w:t>0,721 млн</w:t>
+              <w:t>1,03 млн</w:t>
             </w:r>
           </w:p>
         </w:tc>
@@ -3532,7 +3603,7 @@
               <w:rPr>
                 <w:sz w:val="17"/>
               </w:rPr>
-              <w:t>9,594 млн</w:t>
+              <w:t>9,505 млн</w:t>
             </w:r>
           </w:p>
         </w:tc>
@@ -3555,7 +3626,7 @@
               <w:rPr>
                 <w:sz w:val="17"/>
               </w:rPr>
-              <w:t>95,9%</w:t>
+              <w:t>95%</w:t>
             </w:r>
           </w:p>
         </w:tc>
@@ -3563,7 +3634,7 @@
     </w:tbl>
     <w:p>
       <w:r>
-        <w:t>К концу пятого года занято 9,594 из 10 млн единиц, или 95,9% программы. Первые 9 млн укладываются в направления для текущей команды и будущих наймов. Еще 0,594 млн требуют отдельного решения о переносе из резерва Совета. Свободными останутся 0,406 млн единиц — около 31,6 млн ₽ при продаже. Возврат незакрепленных прав после ухода может увеличить остаток.</w:t>
+        <w:t>К концу пятого года занято 9,505 из 10 млн единиц, или 95% программы. Первые 9 млн укладываются в направления для текущей команды и будущих наймов. Еще 0,505 млн требуют отдельного решения о переносе из резерва Совета. Свободными останутся 0,495 млн единиц — около 38,6 млн ₽ при продаже. Возврат незакрепленных прав после ухода может увеличить остаток.</w:t>
       </w:r>
     </w:p>
     <w:p>
@@ -3576,7 +3647,7 @@
     </w:p>
     <w:p>
       <w:r>
-        <w:t>Если цена расчетной единицы все пять лет остается 12 ₽, те же 75 решений по 3,5 млн ₽ потребуют 21,875 млн единиц — 218,75% всего резерва. Это означает, что рост стоимости нужен не только для потенциального дохода участника, но и для вместимости самой программы.</w:t>
+        <w:t>Если цена расчетной единицы все пять лет остается 12 ₽, те же 59 решений по 5 млн ₽ потребуют 24,583 млн единиц — 245,8% всего резерва. Это означает, что рост стоимости нужен не только для потенциального дохода участника, но и для вместимости самой программы.</w:t>
       </w:r>
     </w:p>
     <w:tbl>
@@ -3703,7 +3774,7 @@
               <w:rPr>
                 <w:sz w:val="18"/>
               </w:rPr>
-              <w:t>Пакет 0,7 оклада</w:t>
+              <w:t>Пакет 1,0 оклада</w:t>
             </w:r>
           </w:p>
         </w:tc>
@@ -3726,9 +3797,9 @@
               <w:rPr>
                 <w:sz w:val="18"/>
               </w:rPr>
-              <w:t>30 полных решений</w:t>
+              <w:t>21 полных решений</w:t>
               <w:br/>
-              <w:t>≈ 6 в год</w:t>
+              <w:t>4,2 в год</w:t>
             </w:r>
           </w:p>
         </w:tc>
@@ -3751,9 +3822,9 @@
               <w:rPr>
                 <w:sz w:val="18"/>
               </w:rPr>
-              <w:t>34 полных решения</w:t>
+              <w:t>24 полных решения</w:t>
               <w:br/>
-              <w:t>6,9 теоретически в год</w:t>
+              <w:t>4,8 в год</w:t>
             </w:r>
           </w:p>
         </w:tc>
@@ -3778,7 +3849,7 @@
               <w:rPr>
                 <w:sz w:val="18"/>
               </w:rPr>
-              <w:t>15 участников ежегодно</w:t>
+              <w:t>59 решений за пять лет</w:t>
             </w:r>
           </w:p>
         </w:tc>
@@ -3801,9 +3872,9 @@
               <w:rPr>
                 <w:sz w:val="18"/>
               </w:rPr>
-              <w:t>пакет 0,288 оклада</w:t>
+              <w:t>пакет 0,366 оклада</w:t>
               <w:br/>
-              <w:t>1,44 млн ₽</w:t>
+              <w:t>1,83 млн ₽</w:t>
             </w:r>
           </w:p>
         </w:tc>
@@ -3826,9 +3897,9 @@
               <w:rPr>
                 <w:sz w:val="18"/>
               </w:rPr>
-              <w:t>пакет 0,32 оклада</w:t>
+              <w:t>пакет 0,407 оклада</w:t>
               <w:br/>
-              <w:t>1,6 млн ₽</w:t>
+              <w:t>2,03 млн ₽</w:t>
             </w:r>
           </w:p>
         </w:tc>
@@ -4053,7 +4124,7 @@
               <w:rPr>
                 <w:sz w:val="17"/>
               </w:rPr>
-              <w:t>7,788 млн ед.</w:t>
+              <w:t>7,234 млн ед.</w:t>
             </w:r>
           </w:p>
         </w:tc>
@@ -4076,7 +4147,7 @@
               <w:rPr>
                 <w:sz w:val="17"/>
               </w:rPr>
-              <w:t>3,79%</w:t>
+              <w:t>3,52%</w:t>
             </w:r>
           </w:p>
         </w:tc>
@@ -4099,7 +4170,7 @@
               <w:rPr>
                 <w:sz w:val="17"/>
               </w:rPr>
-              <w:t>37,9 млн ₽</w:t>
+              <w:t>35,2 млн ₽</w:t>
             </w:r>
           </w:p>
         </w:tc>
@@ -4122,7 +4193,7 @@
               <w:rPr>
                 <w:sz w:val="17"/>
               </w:rPr>
-              <w:t>2,53 млн ₽</w:t>
+              <w:t>3,43 млн ₽</w:t>
             </w:r>
           </w:p>
         </w:tc>
@@ -4170,7 +4241,7 @@
               <w:rPr>
                 <w:sz w:val="17"/>
               </w:rPr>
-              <w:t>8,799 млн ед.</w:t>
+              <w:t>8,458 млн ед.</w:t>
             </w:r>
           </w:p>
         </w:tc>
@@ -4193,7 +4264,7 @@
               <w:rPr>
                 <w:sz w:val="17"/>
               </w:rPr>
-              <w:t>4,28%</w:t>
+              <w:t>4,11%</w:t>
             </w:r>
           </w:p>
         </w:tc>
@@ -4216,7 +4287,7 @@
               <w:rPr>
                 <w:sz w:val="17"/>
               </w:rPr>
-              <w:t>42,8 млн ₽</w:t>
+              <w:t>41,1 млн ₽</w:t>
             </w:r>
           </w:p>
         </w:tc>
@@ -4239,7 +4310,7 @@
               <w:rPr>
                 <w:sz w:val="17"/>
               </w:rPr>
-              <w:t>2,85 млн ₽</w:t>
+              <w:t>3,87 млн ₽</w:t>
             </w:r>
           </w:p>
         </w:tc>
@@ -4287,7 +4358,7 @@
               <w:rPr>
                 <w:sz w:val="17"/>
               </w:rPr>
-              <w:t>9,354 млн ед.</w:t>
+              <w:t>9,161 млн ед.</w:t>
             </w:r>
           </w:p>
         </w:tc>
@@ -4310,7 +4381,7 @@
               <w:rPr>
                 <w:sz w:val="17"/>
               </w:rPr>
-              <w:t>4,55%</w:t>
+              <w:t>4,46%</w:t>
             </w:r>
           </w:p>
         </w:tc>
@@ -4333,7 +4404,7 @@
               <w:rPr>
                 <w:sz w:val="17"/>
               </w:rPr>
-              <w:t>45,5 млн ₽</w:t>
+              <w:t>44,6 млн ₽</w:t>
             </w:r>
           </w:p>
         </w:tc>
@@ -4356,7 +4427,7 @@
               <w:rPr>
                 <w:sz w:val="17"/>
               </w:rPr>
-              <w:t>3,03 млн ₽</w:t>
+              <w:t>4,12 млн ₽</w:t>
             </w:r>
           </w:p>
         </w:tc>
@@ -4404,7 +4475,7 @@
               <w:rPr>
                 <w:sz w:val="17"/>
               </w:rPr>
-              <w:t>9,594 млн ед.</w:t>
+              <w:t>9,505 млн ед.</w:t>
             </w:r>
           </w:p>
         </w:tc>
@@ -4427,7 +4498,7 @@
               <w:rPr>
                 <w:sz w:val="17"/>
               </w:rPr>
-              <w:t>4,67%</w:t>
+              <w:t>4,62%</w:t>
             </w:r>
           </w:p>
         </w:tc>
@@ -4450,7 +4521,7 @@
               <w:rPr>
                 <w:sz w:val="17"/>
               </w:rPr>
-              <w:t>46,7 млн ₽</w:t>
+              <w:t>46,2 млн ₽</w:t>
             </w:r>
           </w:p>
         </w:tc>
@@ -4473,7 +4544,7 @@
               <w:rPr>
                 <w:sz w:val="17"/>
               </w:rPr>
-              <w:t>3,11 млн ₽</w:t>
+              <w:t>4,22 млн ₽</w:t>
             </w:r>
           </w:p>
         </w:tc>
@@ -4481,12 +4552,12 @@
     </w:tbl>
     <w:p>
       <w:r>
-        <w:t>За годы 5–8 команда получила бы около 172,9 млн ₽, а один постоянный участник с пакетом в каждом из пяти лет — около 11,52 млн ₽ до личных налогов. После полного закрепления всех выданных прав ежегодный поток всей команды составил бы около 46,7 млн ₽ при неизменных допущениях.</w:t>
+        <w:t>За годы 5–8 команда получила бы около 167,1 млн ₽, а один постоянный участник с пакетом в каждом из пяти лет — около 15,64 млн ₽ до личных налогов. После полного закрепления всех выданных прав ежегодный поток всей команды составил бы около 46,2 млн ₽ при неизменных допущениях.</w:t>
       </w:r>
     </w:p>
     <w:p>
       <w:r>
-        <w:t>Дивиденды не гарантированы. EBITDA 2 млрд ₽ сама по себе не равна прибыли и деньгам, доступным для распределения. Нужны достаточный денежный поток, отсутствие ограничений по долгу и отдельное решение владельцев; в конкретном году выплата может быть нулевой.</w:t>
+        <w:t>Дивиденды не гарантированы. Показатель 2 млрд ₽ сам по себе не равен прибыли и деньгам, доступным для распределения. Нужны достаточный денежный поток, отсутствие ограничений по долгу и отдельное решение владельцев; в конкретном году выплата может быть нулевой.</w:t>
       </w:r>
     </w:p>
     <w:p>
@@ -4499,7 +4570,7 @@
     </w:p>
     <w:p>
       <w:r>
-        <w:t>Если Мария уходит по соглашению сторон через 18 месяцев после начала закрепления права по первому пакету, у нее остается 50%, или примерно 145 833 единицы. Остальная половина возвращается в общий резерв. При цене 77,83 ₽ за единицу условная валовая стоимость сохраненной части к продаже составляет около 11,35 млн ₽.</w:t>
+        <w:t>Если Мария уходит по соглашению сторон через 18 месяцев после начала закрепления права по первому пакету, у нее остается 50%, или примерно 197 917 единиц. Остальная половина возвращается в общий резерв. При цене 77,83 ₽ за единицу условная валовая стоимость сохраненной части к продаже составляет около 15,4 млн ₽.</w:t>
       </w:r>
     </w:p>
     <w:p>
@@ -4521,7 +4592,7 @@
         <w:t xml:space="preserve">Вывод для инвестора: </w:t>
       </w:r>
       <w:r>
-        <w:t>в модели одновременно видны 4 млрд ₽ привлеченных денег, 51,4% совокупного размытия, 95,9% использования программы и незакрепленная часть, которая еще не подлежит выплате.</w:t>
+        <w:t>в модели одновременно видны 4 млрд ₽ привлеченных денег, 51,4% совокупного размытия, 95,0% использования программы и незакрепленная часть, которая еще не подлежит выплате.</w:t>
       </w:r>
     </w:p>
     <w:p>

</xml_diff>